<commit_message>
Version 0.1.433433: CW (Morse) on DRYAD Enigma, bulk add / export points, chat filters, map icons and more (see docs/UPDATES.md)
</commit_message>
<xml_diff>
--- a/website/downloads/YourCommunityCommunications-GettingStarted.docx
+++ b/website/downloads/YourCommunityCommunications-GettingStarted.docx
@@ -48,7 +48,7 @@
     </w:p>
     <w:p>
       <w:r>
-        <w:t xml:space="preserve">• </w:t>
+        <w:t xml:space="preserve">â€¢ </w:t>
       </w:r>
       <w:r>
         <w:rPr>
@@ -62,7 +62,7 @@
     </w:p>
     <w:p>
       <w:r>
-        <w:t xml:space="preserve">• </w:t>
+        <w:t xml:space="preserve">â€¢ </w:t>
       </w:r>
       <w:r>
         <w:rPr>
@@ -71,12 +71,12 @@
         <w:t xml:space="preserve">No client isolation:</w:t>
       </w:r>
       <w:r>
-        <w:t xml:space="preserve"> many guest, hotel, café and some home routers stop devices talking to each other (called client isolation, AP isolation or guest mode). Turn it off, or use another network.</w:t>
-      </w:r>
-    </w:p>
-    <w:p>
-      <w:r>
-        <w:t xml:space="preserve">• </w:t>
+        <w:t xml:space="preserve"> many guest, hotel, cafÃ© and some home routers stop devices talking to each other (called client isolation, AP isolation or guest mode). Turn it off, or use another network.</w:t>
+      </w:r>
+    </w:p>
+    <w:p>
+      <w:r>
+        <w:t xml:space="preserve">â€¢ </w:t>
       </w:r>
       <w:r>
         <w:rPr>
@@ -90,7 +90,7 @@
     </w:p>
     <w:p>
       <w:r>
-        <w:t xml:space="preserve">• </w:t>
+        <w:t xml:space="preserve">â€¢ </w:t>
       </w:r>
       <w:r>
         <w:rPr>
@@ -1924,7 +1924,7 @@
               <w:rPr>
                 <w:b/>
               </w:rPr>
-              <w:t xml:space="preserve">→ A</w:t>
+              <w:t xml:space="preserve">â†’ A</w:t>
             </w:r>
             <w:r>
               <w:t xml:space="preserve">, </w:t>
@@ -1933,7 +1933,7 @@
               <w:rPr>
                 <w:b/>
               </w:rPr>
-              <w:t xml:space="preserve">→ B</w:t>
+              <w:t xml:space="preserve">â†’ B</w:t>
             </w:r>
             <w:r>
               <w:t xml:space="preserve"> and </w:t>
@@ -1942,7 +1942,7 @@
               <w:rPr>
                 <w:b/>
               </w:rPr>
-              <w:t xml:space="preserve">→ X</w:t>
+              <w:t xml:space="preserve">â†’ X</w:t>
             </w:r>
             <w:r>
               <w:t xml:space="preserve"> put any row onto a channel.</w:t>
@@ -2314,7 +2314,7 @@
     </w:p>
     <w:p>
       <w:r>
-        <w:t xml:space="preserve">• </w:t>
+        <w:t xml:space="preserve">â€¢ </w:t>
       </w:r>
       <w:r>
         <w:rPr>
@@ -2645,7 +2645,16 @@
               <w:t xml:space="preserve">Skip quick set</w:t>
             </w:r>
             <w:r>
-              <w:t xml:space="preserve">, pick </w:t>
+              <w:t xml:space="preserve">, then </w:t>
+            </w:r>
+            <w:r>
+              <w:rPr>
+                <w:b/>
+              </w:rPr>
+              <w:t xml:space="preserve">Next</w:t>
+            </w:r>
+            <w:r>
+              <w:t xml:space="preserve"> on the Advanced or simple note, pick </w:t>
             </w:r>
             <w:r>
               <w:rPr>
@@ -3109,7 +3118,7 @@
               <w:rPr>
                 <w:b/>
               </w:rPr>
-              <w:t xml:space="preserve">Share these settings and DRYAD sheets with the channel…</w:t>
+              <w:t xml:space="preserve">Share these settings and DRYAD sheets with the channelâ€¦</w:t>
             </w:r>
             <w:r>
               <w:t xml:space="preserve"> and tap it.</w:t>
@@ -3667,7 +3676,7 @@
     </w:p>
     <w:p>
       <w:r>
-        <w:t xml:space="preserve">• </w:t>
+        <w:t xml:space="preserve">â€¢ </w:t>
       </w:r>
       <w:r>
         <w:rPr>
@@ -3690,7 +3699,7 @@
     </w:p>
     <w:p>
       <w:r>
-        <w:t xml:space="preserve">• </w:t>
+        <w:t xml:space="preserve">â€¢ </w:t>
       </w:r>
       <w:r>
         <w:rPr>
@@ -3713,7 +3722,7 @@
     </w:p>
     <w:p>
       <w:r>
-        <w:t xml:space="preserve">• </w:t>
+        <w:t xml:space="preserve">â€¢ </w:t>
       </w:r>
       <w:r>
         <w:rPr>
@@ -3727,7 +3736,7 @@
     </w:p>
     <w:p>
       <w:r>
-        <w:t xml:space="preserve">• </w:t>
+        <w:t xml:space="preserve">â€¢ </w:t>
       </w:r>
       <w:r>
         <w:rPr>
@@ -3750,7 +3759,7 @@
     </w:p>
     <w:p>
       <w:r>
-        <w:t xml:space="preserve">• </w:t>
+        <w:t xml:space="preserve">â€¢ </w:t>
       </w:r>
       <w:r>
         <w:rPr>
@@ -3800,7 +3809,7 @@
     </w:p>
     <w:p>
       <w:r>
-        <w:t xml:space="preserve">• </w:t>
+        <w:t xml:space="preserve">â€¢ </w:t>
       </w:r>
       <w:r>
         <w:rPr>
@@ -3832,7 +3841,7 @@
     </w:p>
     <w:p>
       <w:r>
-        <w:t xml:space="preserve">• </w:t>
+        <w:t xml:space="preserve">â€¢ </w:t>
       </w:r>
       <w:r>
         <w:rPr>
@@ -3846,7 +3855,7 @@
     </w:p>
     <w:p>
       <w:r>
-        <w:t xml:space="preserve">• </w:t>
+        <w:t xml:space="preserve">â€¢ </w:t>
       </w:r>
       <w:r>
         <w:rPr>

</xml_diff>